<commit_message>
chore: add cinema API, tests, and batch outputs
Add cinema API module, provider integrations, unit tests,
and batch processing output files.

Co-Authored-By: Claude Opus 4.6 <noreply@anthropic.com>
</commit_message>
<xml_diff>
--- a/outputs/test_docx_engine_academic.docx
+++ b/outputs/test_docx_engine_academic.docx
@@ -4,38 +4,41 @@
   <w:body>
     <w:p>
       <w:pPr>
-        <w:keepNext w:val="0"/>
-        <w:pageBreakBefore w:val="0"/>
-        <w:widowControl/>
-        <w:spacing w:before="960" w:after="240" w:line="240" w:lineRule="auto"/>
+        <w:spacing w:after="480"/>
         <w:jc w:val="center"/>
       </w:pPr>
       <w:r>
         <w:rPr>
-          <w:rFonts w:ascii="Times New Roman" w:hAnsi="Times New Roman" w:eastAsia="Times New Roman"/>
           <w:b/>
-          <w:i w:val="0"/>
-          <w:sz w:val="36"/>
+          <w:sz w:val="48"/>
         </w:rPr>
-        <w:t>Tài liệu thử nghiệm</w:t>
+        <w:t>Test Document with Page Layout</w:t>
       </w:r>
     </w:p>
     <w:p>
       <w:pPr>
-        <w:keepNext w:val="0"/>
-        <w:pageBreakBefore w:val="0"/>
-        <w:widowControl/>
-        <w:spacing w:before="0" w:after="120" w:line="240" w:lineRule="auto"/>
-        <w:jc w:val="center"/>
+        <w:pStyle w:val="Heading1"/>
       </w:pPr>
       <w:r>
+        <w:t>Table of Contents</w:t>
+      </w:r>
+    </w:p>
+    <w:p>
+      <w:r>
+        <w:fldChar w:fldCharType="begin"/>
+        <w:instrText xml:space="preserve">TOC \o "1-3" \h \z \u</w:instrText>
+        <w:fldChar w:fldCharType="separate"/>
+        <w:fldChar w:fldCharType="end"/>
+      </w:r>
+    </w:p>
+    <w:p>
+      <w:r>
         <w:rPr>
-          <w:rFonts w:ascii="Times New Roman" w:hAnsi="Times New Roman" w:eastAsia="Times New Roman"/>
-          <w:b w:val="0"/>
-          <w:i w:val="0"/>
-          <w:sz w:val="24"/>
+          <w:i/>
+          <w:color w:val="808080"/>
+          <w:sz w:val="20"/>
         </w:rPr>
-        <w:t>AI Publisher Pro</w:t>
+        <w:t>[Right-click and select 'Update Field' to populate TOC]</w:t>
       </w:r>
     </w:p>
     <w:p>
@@ -45,338 +48,289 @@
     </w:p>
     <w:p>
       <w:pPr>
+        <w:pStyle w:val="Heading1"/>
         <w:keepNext/>
-        <w:pageBreakBefore w:val="0"/>
-        <w:widowControl/>
-        <w:spacing w:before="480" w:after="240" w:line="240" w:lineRule="auto"/>
-        <w:jc w:val="left"/>
+        <w:keepLines w:val="0"/>
+        <w:spacing w:before="1440" w:after="480" w:line="276" w:lineRule="auto"/>
+        <w:jc w:val="center"/>
       </w:pPr>
       <w:r>
-        <w:rPr>
-          <w:rFonts w:ascii="Times New Roman" w:hAnsi="Times New Roman" w:eastAsia="Times New Roman"/>
-          <w:b/>
-          <w:i w:val="0"/>
-          <w:sz w:val="28"/>
-        </w:rPr>
-        <w:t>Chương 1: Tài liệu thử nghiệm</w:t>
+        <w:t># Chapter 1: Introduction</w:t>
       </w:r>
     </w:p>
     <w:p>
       <w:pPr>
         <w:keepNext w:val="0"/>
-        <w:pageBreakBefore w:val="0"/>
-        <w:widowControl/>
+        <w:keepLines w:val="0"/>
         <w:spacing w:before="0" w:after="0" w:line="360" w:lineRule="auto"/>
-        <w:ind w:firstLine="0"/>
+        <w:ind w:firstLine="432"/>
         <w:jc w:val="both"/>
       </w:pPr>
       <w:r>
         <w:rPr>
-          <w:rFonts w:ascii="Times New Roman" w:hAnsi="Times New Roman" w:eastAsia="Times New Roman"/>
+          <w:rFonts w:ascii="Georgia" w:hAnsi="Georgia"/>
           <w:b w:val="0"/>
           <w:i w:val="0"/>
-          <w:sz w:val="24"/>
+          <w:sz w:val="22"/>
+          <w:u w:val="none"/>
         </w:rPr>
-        <w:t>Đây là đoạn văn đầu tiên của chương. Nó không có thụt lề theo quy ước của sách.</w:t>
+        <w:t>This document tests page layout features including headers, footers, and page breaks.</w:t>
+      </w:r>
+    </w:p>
+    <w:p>
+      <w:pPr>
+        <w:pStyle w:val="Heading2"/>
+        <w:keepNext/>
+        <w:keepLines w:val="0"/>
+        <w:spacing w:before="480" w:after="240" w:line="276" w:lineRule="auto"/>
+        <w:jc w:val="left"/>
+      </w:pPr>
+      <w:r>
+        <w:t>## 1.1 Overview</w:t>
       </w:r>
     </w:p>
     <w:p>
       <w:pPr>
         <w:keepNext w:val="0"/>
-        <w:pageBreakBefore w:val="0"/>
-        <w:widowControl/>
+        <w:keepLines w:val="0"/>
         <w:spacing w:before="0" w:after="0" w:line="360" w:lineRule="auto"/>
-        <w:ind w:firstLine="720"/>
+        <w:ind w:firstLine="432"/>
         <w:jc w:val="both"/>
       </w:pPr>
       <w:r>
         <w:rPr>
-          <w:rFonts w:ascii="Times New Roman" w:hAnsi="Times New Roman" w:eastAsia="Times New Roman"/>
+          <w:rFonts w:ascii="Georgia" w:hAnsi="Georgia"/>
+          <w:b w:val="0"/>
+          <w:i w:val="0"/>
+          <w:sz w:val="22"/>
+          <w:u w:val="none"/>
+        </w:rPr>
+        <w:t>This section provides an overview of the document.</w:t>
+      </w:r>
+    </w:p>
+    <w:p>
+      <w:pPr>
+        <w:pStyle w:val="Heading2"/>
+        <w:keepNext/>
+        <w:keepLines w:val="0"/>
+        <w:spacing w:before="480" w:after="240" w:line="276" w:lineRule="auto"/>
+        <w:jc w:val="left"/>
+      </w:pPr>
+      <w:r>
+        <w:t>## 1.2 Goals</w:t>
+      </w:r>
+    </w:p>
+    <w:p>
+      <w:pPr>
+        <w:pStyle w:val="Heading3"/>
+        <w:keepNext/>
+        <w:keepLines w:val="0"/>
+        <w:spacing w:before="360" w:after="120" w:line="276" w:lineRule="auto"/>
+        <w:jc w:val="left"/>
+      </w:pPr>
+      <w:r>
+        <w:t>The goals of this document are:</w:t>
+      </w:r>
+    </w:p>
+    <w:p>
+      <w:pPr>
+        <w:pStyle w:val="ListBullet"/>
+        <w:ind w:left="360"/>
+      </w:pPr>
+      <w:r>
+        <w:rPr>
+          <w:rFonts w:ascii="Georgia" w:hAnsi="Georgia"/>
           <w:b w:val="0"/>
           <w:i w:val="0"/>
           <w:sz w:val="24"/>
         </w:rPr>
-        <w:t xml:space="preserve">Đây là đoạn văn thứ hai. Nó sẽ có thụt lề dòng đầu tiên. </w:t>
+        <w:t>Test page size configuration</w:t>
       </w:r>
+    </w:p>
+    <w:p>
+      <w:pPr>
+        <w:pStyle w:val="ListBullet"/>
+        <w:ind w:left="360"/>
+      </w:pPr>
       <w:r>
         <w:rPr>
-          <w:rFonts w:ascii="Times New Roman" w:hAnsi="Times New Roman" w:eastAsia="Times New Roman"/>
-          <w:b/>
-          <w:i w:val="0"/>
-          <w:sz w:val="24"/>
-        </w:rPr>
-        <w:t>Đoạn này có chữ đậm</w:t>
-      </w:r>
-      <w:r>
-        <w:rPr>
-          <w:rFonts w:ascii="Times New Roman" w:hAnsi="Times New Roman" w:eastAsia="Times New Roman"/>
+          <w:rFonts w:ascii="Georgia" w:hAnsi="Georgia"/>
           <w:b w:val="0"/>
           <w:i w:val="0"/>
           <w:sz w:val="24"/>
         </w:rPr>
-        <w:t xml:space="preserve"> và </w:t>
+        <w:t>Test margins</w:t>
       </w:r>
+    </w:p>
+    <w:p>
+      <w:pPr>
+        <w:pStyle w:val="ListBullet"/>
+        <w:ind w:left="360"/>
+      </w:pPr>
       <w:r>
         <w:rPr>
-          <w:rFonts w:ascii="Times New Roman" w:hAnsi="Times New Roman" w:eastAsia="Times New Roman"/>
-          <w:b w:val="0"/>
-          <w:i/>
-          <w:sz w:val="24"/>
-        </w:rPr>
-        <w:t>chữ nghiêng</w:t>
-      </w:r>
-      <w:r>
-        <w:rPr>
-          <w:rFonts w:ascii="Times New Roman" w:hAnsi="Times New Roman" w:eastAsia="Times New Roman"/>
+          <w:rFonts w:ascii="Georgia" w:hAnsi="Georgia"/>
           <w:b w:val="0"/>
           <w:i w:val="0"/>
           <w:sz w:val="24"/>
         </w:rPr>
-        <w:t>.</w:t>
+        <w:t>Test header with document title</w:t>
       </w:r>
     </w:p>
     <w:p>
       <w:pPr>
-        <w:keepNext/>
-        <w:pageBreakBefore w:val="0"/>
-        <w:widowControl/>
-        <w:spacing w:before="360" w:after="120" w:line="240" w:lineRule="auto"/>
-        <w:jc w:val="left"/>
+        <w:pStyle w:val="ListBullet"/>
+        <w:ind w:left="360"/>
       </w:pPr>
       <w:r>
         <w:rPr>
-          <w:rFonts w:ascii="Times New Roman" w:hAnsi="Times New Roman" w:eastAsia="Times New Roman"/>
-          <w:b/>
+          <w:rFonts w:ascii="Georgia" w:hAnsi="Georgia"/>
+          <w:b w:val="0"/>
           <w:i w:val="0"/>
           <w:sz w:val="24"/>
         </w:rPr>
-        <w:t>Phần 1.1: Nội dung chi tiết</w:t>
+        <w:t>Test footer with page numbers</w:t>
+      </w:r>
+    </w:p>
+    <w:p>
+      <w:pPr>
+        <w:pStyle w:val="ListBullet"/>
+        <w:ind w:left="360"/>
+      </w:pPr>
+      <w:r>
+        <w:rPr>
+          <w:rFonts w:ascii="Georgia" w:hAnsi="Georgia"/>
+          <w:b w:val="0"/>
+          <w:i w:val="0"/>
+          <w:sz w:val="24"/>
+        </w:rPr>
+        <w:t>Test TOC generation</w:t>
+      </w:r>
+    </w:p>
+    <w:p>
+      <w:pPr>
+        <w:pStyle w:val="ListBullet"/>
+        <w:ind w:left="360"/>
+      </w:pPr>
+      <w:r>
+        <w:rPr>
+          <w:rFonts w:ascii="Georgia" w:hAnsi="Georgia"/>
+          <w:b w:val="0"/>
+          <w:i w:val="0"/>
+          <w:sz w:val="24"/>
+        </w:rPr>
+        <w:t>Test page breaks before chapters</w:t>
+      </w:r>
+    </w:p>
+    <w:p>
+      <w:r>
+        <w:br w:type="page"/>
+      </w:r>
+    </w:p>
+    <w:p>
+      <w:pPr>
+        <w:pStyle w:val="Heading1"/>
+        <w:keepNext/>
+        <w:keepLines w:val="0"/>
+        <w:spacing w:before="1440" w:after="480" w:line="276" w:lineRule="auto"/>
+        <w:jc w:val="center"/>
+      </w:pPr>
+      <w:r>
+        <w:t># Chapter 2: Implementation</w:t>
       </w:r>
     </w:p>
     <w:p>
       <w:pPr>
         <w:keepNext w:val="0"/>
-        <w:pageBreakBefore w:val="0"/>
-        <w:widowControl/>
+        <w:keepLines w:val="0"/>
         <w:spacing w:before="0" w:after="0" w:line="360" w:lineRule="auto"/>
-        <w:ind w:firstLine="0"/>
+        <w:ind w:firstLine="432"/>
         <w:jc w:val="both"/>
       </w:pPr>
       <w:r>
         <w:rPr>
-          <w:rFonts w:ascii="Times New Roman" w:hAnsi="Times New Roman" w:eastAsia="Times New Roman"/>
+          <w:rFonts w:ascii="Georgia" w:hAnsi="Georgia"/>
           <w:b w:val="0"/>
           <w:i w:val="0"/>
-          <w:sz w:val="24"/>
+          <w:sz w:val="22"/>
+          <w:u w:val="none"/>
         </w:rPr>
-        <w:t>Một số nội dung chi tiết với:</w:t>
+        <w:t>This is the second chapter.</w:t>
+      </w:r>
+    </w:p>
+    <w:p>
+      <w:pPr>
+        <w:pStyle w:val="Heading2"/>
+        <w:keepNext/>
+        <w:keepLines w:val="0"/>
+        <w:spacing w:before="480" w:after="240" w:line="276" w:lineRule="auto"/>
+        <w:jc w:val="left"/>
+      </w:pPr>
+      <w:r>
+        <w:t>## 2.1 Technical Details</w:t>
       </w:r>
     </w:p>
     <w:p>
       <w:pPr>
         <w:keepNext w:val="0"/>
-        <w:pageBreakBefore w:val="0"/>
-        <w:widowControl/>
-        <w:spacing w:before="0" w:after="120" w:line="360" w:lineRule="auto"/>
-        <w:ind w:left="425"/>
-        <w:jc w:val="left"/>
+        <w:keepLines w:val="0"/>
+        <w:spacing w:before="0" w:after="0" w:line="360" w:lineRule="auto"/>
+        <w:ind w:firstLine="432"/>
+        <w:jc w:val="both"/>
       </w:pPr>
       <w:r>
         <w:rPr>
-          <w:rFonts w:ascii="Times New Roman" w:hAnsi="Times New Roman" w:eastAsia="Times New Roman"/>
+          <w:rFonts w:ascii="Georgia" w:hAnsi="Georgia"/>
           <w:b w:val="0"/>
           <w:i w:val="0"/>
-          <w:sz w:val="24"/>
+          <w:sz w:val="22"/>
+          <w:u w:val="none"/>
         </w:rPr>
-        <w:t xml:space="preserve">• </w:t>
+        <w:t>Some technical details here.</w:t>
       </w:r>
+    </w:p>
+    <w:p>
       <w:r>
-        <w:rPr>
-          <w:rFonts w:ascii="Times New Roman" w:hAnsi="Times New Roman" w:eastAsia="Times New Roman"/>
-          <w:b w:val="0"/>
-          <w:i w:val="0"/>
-          <w:sz w:val="24"/>
-        </w:rPr>
-        <w:t>Mục đầu tiên</w:t>
+        <w:br w:type="page"/>
+      </w:r>
+    </w:p>
+    <w:p>
+      <w:pPr>
+        <w:pStyle w:val="Heading1"/>
+        <w:keepNext/>
+        <w:keepLines w:val="0"/>
+        <w:spacing w:before="1440" w:after="480" w:line="276" w:lineRule="auto"/>
+        <w:jc w:val="center"/>
+      </w:pPr>
+      <w:r>
+        <w:t># Chapter 3: Conclusion</w:t>
       </w:r>
     </w:p>
     <w:p>
       <w:pPr>
         <w:keepNext w:val="0"/>
-        <w:pageBreakBefore w:val="0"/>
-        <w:widowControl/>
-        <w:spacing w:before="0" w:after="120" w:line="360" w:lineRule="auto"/>
-        <w:ind w:left="425"/>
-        <w:jc w:val="left"/>
-      </w:pPr>
-      <w:r>
-        <w:rPr>
-          <w:rFonts w:ascii="Times New Roman" w:hAnsi="Times New Roman" w:eastAsia="Times New Roman"/>
-          <w:b w:val="0"/>
-          <w:i w:val="0"/>
-          <w:sz w:val="24"/>
-        </w:rPr>
-        <w:t xml:space="preserve">• </w:t>
-      </w:r>
-      <w:r>
-        <w:rPr>
-          <w:rFonts w:ascii="Times New Roman" w:hAnsi="Times New Roman" w:eastAsia="Times New Roman"/>
-          <w:b w:val="0"/>
-          <w:i w:val="0"/>
-          <w:sz w:val="24"/>
-        </w:rPr>
-        <w:t>Mục thứ hai</w:t>
-      </w:r>
-    </w:p>
-    <w:p>
-      <w:pPr>
-        <w:keepNext w:val="0"/>
-        <w:pageBreakBefore w:val="0"/>
-        <w:widowControl/>
-        <w:spacing w:before="0" w:after="120" w:line="360" w:lineRule="auto"/>
-        <w:ind w:left="425"/>
-        <w:jc w:val="left"/>
-      </w:pPr>
-      <w:r>
-        <w:rPr>
-          <w:rFonts w:ascii="Times New Roman" w:hAnsi="Times New Roman" w:eastAsia="Times New Roman"/>
-          <w:b w:val="0"/>
-          <w:i w:val="0"/>
-          <w:sz w:val="24"/>
-        </w:rPr>
-        <w:t xml:space="preserve">• </w:t>
-      </w:r>
-      <w:r>
-        <w:rPr>
-          <w:rFonts w:ascii="Times New Roman" w:hAnsi="Times New Roman" w:eastAsia="Times New Roman"/>
-          <w:b w:val="0"/>
-          <w:i w:val="0"/>
-          <w:sz w:val="24"/>
-        </w:rPr>
-        <w:t>Mục thứ ba</w:t>
-      </w:r>
-    </w:p>
-    <w:p>
-      <w:pPr>
-        <w:keepNext/>
-        <w:pageBreakBefore w:val="0"/>
-        <w:widowControl/>
-        <w:spacing w:before="240" w:after="120" w:line="240" w:lineRule="auto"/>
-        <w:jc w:val="left"/>
-      </w:pPr>
-      <w:r>
-        <w:rPr>
-          <w:rFonts w:ascii="Times New Roman" w:hAnsi="Times New Roman" w:eastAsia="Times New Roman"/>
-          <w:b/>
-          <w:i/>
-          <w:sz w:val="24"/>
-        </w:rPr>
-        <w:t>Phần 1.1.1: Chi tiết hơn nữa</w:t>
-      </w:r>
-    </w:p>
-    <w:p>
-      <w:pPr>
-        <w:keepNext w:val="0"/>
-        <w:pageBreakBefore w:val="0"/>
-        <w:widowControl/>
-        <w:spacing w:before="240" w:after="240" w:line="276" w:lineRule="auto"/>
-        <w:ind w:left="567" w:right="567"/>
+        <w:keepLines w:val="0"/>
+        <w:spacing w:before="0" w:after="0" w:line="360" w:lineRule="auto"/>
+        <w:ind w:firstLine="432"/>
         <w:jc w:val="both"/>
       </w:pPr>
       <w:r>
         <w:rPr>
-          <w:rFonts w:ascii="Times New Roman" w:hAnsi="Times New Roman" w:eastAsia="Times New Roman"/>
+          <w:rFonts w:ascii="Georgia" w:hAnsi="Georgia"/>
           <w:b w:val="0"/>
           <w:i w:val="0"/>
           <w:sz w:val="22"/>
+          <w:u w:val="none"/>
         </w:rPr>
-        <w:t>Đây là một trích dẫn quan trọng từ một nguồn đáng tin cậy.</w:t>
-      </w:r>
-    </w:p>
-    <w:p>
-      <w:pPr>
-        <w:keepNext w:val="0"/>
-        <w:pageBreakBefore w:val="0"/>
-        <w:widowControl/>
-        <w:spacing w:before="0" w:after="0" w:line="360" w:lineRule="auto"/>
-        <w:ind w:firstLine="720"/>
-        <w:jc w:val="both"/>
-      </w:pPr>
-      <w:r>
-        <w:rPr>
-          <w:rFonts w:ascii="Times New Roman" w:hAnsi="Times New Roman" w:eastAsia="Times New Roman"/>
-          <w:b w:val="0"/>
-          <w:i w:val="0"/>
-          <w:sz w:val="24"/>
-        </w:rPr>
-        <w:t>Và đây là một đoạn code:</w:t>
-      </w:r>
-    </w:p>
-    <w:p>
-      <w:pPr>
-        <w:keepNext w:val="0"/>
-        <w:pageBreakBefore w:val="0"/>
-        <w:widowControl/>
-        <w:spacing w:before="120" w:after="120" w:line="240" w:lineRule="auto"/>
-        <w:jc w:val="left"/>
-        <w:shd w:fill="F0F0F0"/>
-      </w:pPr>
-      <w:r>
-        <w:rPr>
-          <w:rFonts w:ascii="Courier New" w:hAnsi="Courier New" w:eastAsia="Courier New"/>
-          <w:b w:val="0"/>
-          <w:i w:val="0"/>
-          <w:sz w:val="20"/>
-        </w:rPr>
-        <w:t>def hello():</w:t>
-        <w:br/>
-        <w:t xml:space="preserve">    print("Hello, World!")</w:t>
-      </w:r>
-    </w:p>
-    <w:p>
-      <w:pPr>
-        <w:keepNext/>
-        <w:pageBreakBefore w:val="0"/>
-        <w:widowControl/>
-        <w:spacing w:before="480" w:after="240" w:line="240" w:lineRule="auto"/>
-        <w:jc w:val="left"/>
-      </w:pPr>
-      <w:r>
-        <w:rPr>
-          <w:rFonts w:ascii="Times New Roman" w:hAnsi="Times New Roman" w:eastAsia="Times New Roman"/>
-          <w:b/>
-          <w:i w:val="0"/>
-          <w:sz w:val="28"/>
-        </w:rPr>
-        <w:t>Chương 2: Kết luận</w:t>
-      </w:r>
-    </w:p>
-    <w:p>
-      <w:pPr>
-        <w:keepNext w:val="0"/>
-        <w:pageBreakBefore w:val="0"/>
-        <w:widowControl/>
-        <w:spacing w:before="0" w:after="0" w:line="360" w:lineRule="auto"/>
-        <w:ind w:firstLine="0"/>
-        <w:jc w:val="both"/>
-      </w:pPr>
-      <w:r>
-        <w:rPr>
-          <w:rFonts w:ascii="Times New Roman" w:hAnsi="Times New Roman" w:eastAsia="Times New Roman"/>
-          <w:b w:val="0"/>
-          <w:i w:val="0"/>
-          <w:sz w:val="24"/>
-        </w:rPr>
-        <w:t>Đây là chương cuối cùng của tài liệu.</w:t>
+        <w:t>Final conclusions.</w:t>
       </w:r>
     </w:p>
     <w:sectPr>
       <w:headerReference w:type="default" r:id="rId9"/>
       <w:footerReference w:type="default" r:id="rId10"/>
-      <w:pgSz w:w="11906" w:h="16838"/>
-      <w:pgMar w:top="1417" w:right="1417" w:bottom="1417" w:left="1417" w:header="720" w:footer="720" w:gutter="0"/>
+      <w:pgSz w:w="11909" w:h="16834"/>
+      <w:pgMar w:top="1440" w:right="1440" w:bottom="1440" w:left="1800" w:header="720" w:footer="720" w:gutter="0"/>
       <w:cols w:space="720"/>
-      <w:titlePg/>
       <w:docGrid w:linePitch="360"/>
     </w:sectPr>
   </w:body>
@@ -391,12 +345,21 @@
       <w:jc w:val="center"/>
     </w:pPr>
     <w:r>
-      <w:rPr>
-        <w:rFonts w:ascii="Times New Roman" w:hAnsi="Times New Roman"/>
+      <w:fldChar w:fldCharType="begin"/>
+    </w:r>
+    <w:r>
+      <w:instrText xml:space="preserve">PAGE</w:instrText>
+    </w:r>
+    <w:r>
+      <w:fldChar w:fldCharType="separate"/>
+    </w:r>
+    <w:r>
+      <w:rPr>
         <w:sz w:val="20"/>
       </w:rPr>
-      <w:fldChar w:fldCharType="begin"/>
-      <w:instrText>PAGE</w:instrText>
+      <w:t>1</w:t>
+    </w:r>
+    <w:r>
       <w:fldChar w:fldCharType="end"/>
     </w:r>
   </w:p>
@@ -408,13 +371,13 @@
   <w:p>
     <w:pPr>
       <w:pStyle w:val="Header"/>
+      <w:jc w:val="center"/>
     </w:pPr>
     <w:r>
       <w:rPr>
-        <w:rFonts w:ascii="Times New Roman" w:hAnsi="Times New Roman"/>
         <w:sz w:val="20"/>
       </w:rPr>
-      <w:t>Tài liệu thử nghiệm</w:t>
+      <w:t>Test Document with Page Layout</w:t>
     </w:r>
   </w:p>
 </w:hdr>
@@ -783,6 +746,13 @@
     <w:name w:val="Normal"/>
     <w:qFormat/>
     <w:rsid w:val="00FC693F"/>
+    <w:pPr>
+      <w:spacing w:after="120" w:line="276" w:lineRule="auto"/>
+    </w:pPr>
+    <w:rPr>
+      <w:rFonts w:ascii="Georgia" w:hAnsi="Georgia"/>
+      <w:sz w:val="24"/>
+    </w:rPr>
   </w:style>
   <w:style w:type="paragraph" w:styleId="Header">
     <w:name w:val="header"/>
@@ -839,15 +809,17 @@
     <w:pPr>
       <w:keepNext/>
       <w:keepLines/>
-      <w:spacing w:before="480" w:after="0"/>
+      <w:pageBreakBefore/>
+      <w:spacing w:before="1440" w:after="480"/>
       <w:outlineLvl w:val="0"/>
     </w:pPr>
     <w:rPr>
-      <w:rFonts w:asciiTheme="majorHAnsi" w:eastAsiaTheme="majorEastAsia" w:hAnsiTheme="majorHAnsi" w:cstheme="majorBidi"/>
+      <w:rFonts w:asciiTheme="majorHAnsi" w:eastAsiaTheme="majorEastAsia" w:hAnsiTheme="majorHAnsi" w:cstheme="majorBidi" w:ascii="Georgia" w:hAnsi="Georgia"/>
       <w:b/>
       <w:bCs/>
+      <w:i w:val="0"/>
       <w:color w:val="365F91" w:themeColor="accent1" w:themeShade="BF"/>
-      <w:sz w:val="28"/>
+      <w:sz w:val="48"/>
       <w:szCs w:val="28"/>
     </w:rPr>
   </w:style>
@@ -863,15 +835,16 @@
     <w:pPr>
       <w:keepNext/>
       <w:keepLines/>
-      <w:spacing w:before="200" w:after="0"/>
+      <w:spacing w:before="480" w:after="240"/>
       <w:outlineLvl w:val="1"/>
     </w:pPr>
     <w:rPr>
-      <w:rFonts w:asciiTheme="majorHAnsi" w:eastAsiaTheme="majorEastAsia" w:hAnsiTheme="majorHAnsi" w:cstheme="majorBidi"/>
+      <w:rFonts w:asciiTheme="majorHAnsi" w:eastAsiaTheme="majorEastAsia" w:hAnsiTheme="majorHAnsi" w:cstheme="majorBidi" w:ascii="Georgia" w:hAnsi="Georgia"/>
       <w:b/>
       <w:bCs/>
+      <w:i w:val="0"/>
       <w:color w:val="4F81BD" w:themeColor="accent1"/>
-      <w:sz w:val="26"/>
+      <w:sz w:val="32"/>
       <w:szCs w:val="26"/>
     </w:rPr>
   </w:style>
@@ -887,14 +860,16 @@
     <w:pPr>
       <w:keepNext/>
       <w:keepLines/>
-      <w:spacing w:before="200" w:after="0"/>
+      <w:spacing w:before="360" w:after="120"/>
       <w:outlineLvl w:val="2"/>
     </w:pPr>
     <w:rPr>
-      <w:rFonts w:asciiTheme="majorHAnsi" w:eastAsiaTheme="majorEastAsia" w:hAnsiTheme="majorHAnsi" w:cstheme="majorBidi"/>
+      <w:rFonts w:asciiTheme="majorHAnsi" w:eastAsiaTheme="majorEastAsia" w:hAnsiTheme="majorHAnsi" w:cstheme="majorBidi" w:ascii="Georgia" w:hAnsi="Georgia"/>
       <w:b/>
       <w:bCs/>
+      <w:i w:val="0"/>
       <w:color w:val="4F81BD" w:themeColor="accent1"/>
+      <w:sz w:val="26"/>
     </w:rPr>
   </w:style>
   <w:style w:type="paragraph" w:styleId="Heading4">

</xml_diff>